<commit_message>
feat(inbox/aan): Book 06 Telecom Modernization briefing deck + figure write-back
31-slide spec-compliant deck (Date Code 2026-07-07 15:57 ET): voice physics
build (G.114/MOS/jitter), Amazon Connect .com exception, Teams Phone GCC
Moderate, hybrid agent, TIC 3.0 PEP, FedRAMP 20x + compliance clock, 4-phase
roadmap build. Write-back adds tc-fig-15/16/17 (Teams Phone, PSTN/SBC,
TIC 3.0) to the qmd; docx re-rendered (17 figures). Zip kit refreshed to
2026-07-07_1604ET (30 entries, adds Book_06 pptx).

Co-Authored-By: Claude Fable 5 <noreply@anthropic.com>
</commit_message>
<xml_diff>
--- a/inbox/Application Aware Networking/Book_06_FedAAN_Federal_Telecommunications_Modernization.docx
+++ b/inbox/Application Aware Networking/Book_06_FedAAN_Federal_Telecommunications_Modernization.docx
@@ -31,7 +31,7 @@
         <w:pStyle w:val="Date"/>
       </w:pPr>
       <w:r>
-        <w:t xml:space="preserve">2026-06-29</w:t>
+        <w:t xml:space="preserve">Invalid Date</w:t>
       </w:r>
     </w:p>
     <w:sdt>
@@ -114,7 +114,7 @@
                     <a:graphicData uri="http://schemas.openxmlformats.org/drawingml/2006/picture">
                       <pic:pic>
                         <pic:nvPicPr>
-                          <pic:cNvPr descr="/opt/quarto/share/formats/docx/warning.png" id="11" name="Picture"/>
+                          <pic:cNvPr descr="C:\Program Files\Quarto\share\formats\docx\warning.png" id="11" name="Picture"/>
                           <pic:cNvPicPr>
                             <a:picLocks noChangeArrowheads="1" noChangeAspect="1"/>
                           </pic:cNvPicPr>
@@ -174,7 +174,7 @@
               <w:pStyle w:val="BodyText"/>
             </w:pPr>
             <w:pPr>
-              <w:spacing w:before="16" w:after="16"/>
+              <w:spacing w:before="16"/>
             </w:pPr>
             <w:r>
               <w:t xml:space="preserve">This document is a</w:t>
@@ -207,6 +207,27 @@
             </w:r>
             <w:r>
               <w:t xml:space="preserve">. It is an attempt at a comprehensive SSA-wide technical roadmap and has not been reviewed or approved by the SSA CIO Office, the Office of Information Security (OIS), or organizational leadership. All recommendations, vendor selections, control mappings, and implementation timelines are subject to revision pending formal review by the SSA CIO Office and organizational components.</w:t>
+            </w:r>
+          </w:p>
+          <w:p>
+            <w:pPr>
+              <w:pStyle w:val="BodyText"/>
+            </w:pPr>
+            <w:pPr>
+              <w:spacing w:after="16"/>
+            </w:pPr>
+            <w:r>
+              <w:rPr>
+                <w:b/>
+                <w:bCs/>
+              </w:rPr>
+              <w:t xml:space="preserve">Date Code:</w:t>
+            </w:r>
+            <w:r>
+              <w:t xml:space="preserve"> </w:t>
+            </w:r>
+            <w:r>
+              <w:t xml:space="preserve">2026-07-07 16:04 ET</w:t>
             </w:r>
           </w:p>
           <w:p/>
@@ -2139,7 +2160,7 @@
     </w:p>
     <w:bookmarkEnd w:id="44"/>
     <w:bookmarkEnd w:id="45"/>
-    <w:bookmarkStart w:id="56" w:name="X839c1c655003bd3897e8b5851a50b9508e76f4d"/>
+    <w:bookmarkStart w:id="62" w:name="X839c1c655003bd3897e8b5851a50b9508e76f4d"/>
     <w:p>
       <w:pPr>
         <w:pStyle w:val="Heading1"/>
@@ -2148,7 +2169,7 @@
         <w:t xml:space="preserve">4. Microsoft Teams Phone: Replacing the Legacy PBX in GCC Moderate</w:t>
       </w:r>
     </w:p>
-    <w:bookmarkStart w:id="46" w:name="what-teams-phone-is"/>
+    <w:bookmarkStart w:id="49" w:name="what-teams-phone-is"/>
     <w:p>
       <w:pPr>
         <w:pStyle w:val="Heading2"/>
@@ -2183,8 +2204,63 @@
         <w:t xml:space="preserve">Fixing the network for Teams meetings fixes it for Teams Phone simultaneously.</w:t>
       </w:r>
     </w:p>
-    <w:bookmarkEnd w:id="46"/>
-    <w:bookmarkStart w:id="47" w:name="X6ece0fcf0855462989a3ddd91807ca0d93f5e19"/>
+    <w:p>
+      <w:pPr>
+        <w:pStyle w:val="CaptionedFigure"/>
+      </w:pPr>
+      <w:r>
+        <w:drawing>
+          <wp:inline>
+            <wp:extent cx="5334000" cy="3000375"/>
+            <wp:effectExtent b="0" l="0" r="0" t="0"/>
+            <wp:docPr descr="Teams Phone: the cloud PBX inside GCC Moderate" title="" id="47" name="Picture"/>
+            <a:graphic>
+              <a:graphicData uri="http://schemas.openxmlformats.org/drawingml/2006/picture">
+                <pic:pic>
+                  <pic:nvPicPr>
+                    <pic:cNvPr descr="figs/tc-fig-15-teams-phone-gcc.png" id="48" name="Picture"/>
+                    <pic:cNvPicPr>
+                      <a:picLocks noChangeArrowheads="1" noChangeAspect="1"/>
+                    </pic:cNvPicPr>
+                  </pic:nvPicPr>
+                  <pic:blipFill>
+                    <a:blip r:embed="rId46"/>
+                    <a:stretch>
+                      <a:fillRect/>
+                    </a:stretch>
+                  </pic:blipFill>
+                  <pic:spPr bwMode="auto">
+                    <a:xfrm>
+                      <a:off x="0" y="0"/>
+                      <a:ext cx="5334000" cy="3000375"/>
+                    </a:xfrm>
+                    <a:prstGeom prst="rect">
+                      <a:avLst/>
+                    </a:prstGeom>
+                    <a:noFill/>
+                    <a:ln w="9525">
+                      <a:noFill/>
+                      <a:headEnd/>
+                      <a:tailEnd/>
+                    </a:ln>
+                  </pic:spPr>
+                </pic:pic>
+              </a:graphicData>
+            </a:graphic>
+          </wp:inline>
+        </w:drawing>
+      </w:r>
+    </w:p>
+    <w:p>
+      <w:pPr>
+        <w:pStyle w:val="ImageCaption"/>
+      </w:pPr>
+      <w:r>
+        <w:t xml:space="preserve">Teams Phone: the cloud PBX inside GCC Moderate</w:t>
+      </w:r>
+    </w:p>
+    <w:bookmarkEnd w:id="49"/>
+    <w:bookmarkStart w:id="53" w:name="X6ece0fcf0855462989a3ddd91807ca0d93f5e19"/>
     <w:p>
       <w:pPr>
         <w:pStyle w:val="Heading2"/>
@@ -2195,7 +2271,62 @@
     </w:p>
     <w:p>
       <w:pPr>
-        <w:pStyle w:val="FirstParagraph"/>
+        <w:pStyle w:val="CaptionedFigure"/>
+      </w:pPr>
+      <w:r>
+        <w:drawing>
+          <wp:inline>
+            <wp:extent cx="5334000" cy="3000375"/>
+            <wp:effectExtent b="0" l="0" r="0" t="0"/>
+            <wp:docPr descr="PSTN connectivity: Calling Plans, Direct Routing, and the SBC decision" title="" id="51" name="Picture"/>
+            <a:graphic>
+              <a:graphicData uri="http://schemas.openxmlformats.org/drawingml/2006/picture">
+                <pic:pic>
+                  <pic:nvPicPr>
+                    <pic:cNvPr descr="figs/tc-fig-16-pstn-sbc-options.png" id="52" name="Picture"/>
+                    <pic:cNvPicPr>
+                      <a:picLocks noChangeArrowheads="1" noChangeAspect="1"/>
+                    </pic:cNvPicPr>
+                  </pic:nvPicPr>
+                  <pic:blipFill>
+                    <a:blip r:embed="rId50"/>
+                    <a:stretch>
+                      <a:fillRect/>
+                    </a:stretch>
+                  </pic:blipFill>
+                  <pic:spPr bwMode="auto">
+                    <a:xfrm>
+                      <a:off x="0" y="0"/>
+                      <a:ext cx="5334000" cy="3000375"/>
+                    </a:xfrm>
+                    <a:prstGeom prst="rect">
+                      <a:avLst/>
+                    </a:prstGeom>
+                    <a:noFill/>
+                    <a:ln w="9525">
+                      <a:noFill/>
+                      <a:headEnd/>
+                      <a:tailEnd/>
+                    </a:ln>
+                  </pic:spPr>
+                </pic:pic>
+              </a:graphicData>
+            </a:graphic>
+          </wp:inline>
+        </w:drawing>
+      </w:r>
+    </w:p>
+    <w:p>
+      <w:pPr>
+        <w:pStyle w:val="ImageCaption"/>
+      </w:pPr>
+      <w:r>
+        <w:t xml:space="preserve">PSTN connectivity: Calling Plans, Direct Routing, and the SBC decision</w:t>
+      </w:r>
+    </w:p>
+    <w:p>
+      <w:pPr>
+        <w:pStyle w:val="BodyText"/>
       </w:pPr>
       <w:r>
         <w:t xml:space="preserve">Connecting Teams Phone to the PSTN requires one of two approaches:</w:t>
@@ -2303,8 +2434,8 @@
         <w:t xml:space="preserve">— confirm before procurement.</w:t>
       </w:r>
     </w:p>
-    <w:bookmarkEnd w:id="47"/>
-    <w:bookmarkStart w:id="54" w:name="e911-federal-legal-requirements"/>
+    <w:bookmarkEnd w:id="53"/>
+    <w:bookmarkStart w:id="60" w:name="e911-federal-legal-requirements"/>
     <w:p>
       <w:pPr>
         <w:pStyle w:val="Heading2"/>
@@ -2322,18 +2453,18 @@
           <wp:inline>
             <wp:extent cx="5334000" cy="2755900"/>
             <wp:effectExtent b="0" l="0" r="0" t="0"/>
-            <wp:docPr descr="E911 Compliance and Teams Phone GCC Boundary" title="" id="49" name="Picture"/>
+            <wp:docPr descr="E911 Compliance and Teams Phone GCC Boundary" title="" id="55" name="Picture"/>
             <a:graphic>
               <a:graphicData uri="http://schemas.openxmlformats.org/drawingml/2006/picture">
                 <pic:pic>
                   <pic:nvPicPr>
-                    <pic:cNvPr descr="figs/tc-fig-06-e911-boundary.png" id="50" name="Picture"/>
+                    <pic:cNvPr descr="figs/tc-fig-06-e911-boundary.png" id="56" name="Picture"/>
                     <pic:cNvPicPr>
                       <a:picLocks noChangeArrowheads="1" noChangeAspect="1"/>
                     </pic:cNvPicPr>
                   </pic:nvPicPr>
                   <pic:blipFill>
-                    <a:blip r:embed="rId48"/>
+                    <a:blip r:embed="rId54"/>
                     <a:stretch>
                       <a:fillRect/>
                     </a:stretch>
@@ -2451,18 +2582,18 @@
           <wp:inline>
             <wp:extent cx="5334000" cy="2726266"/>
             <wp:effectExtent b="0" l="0" r="0" t="0"/>
-            <wp:docPr descr="Legacy PBX to Teams Phone GCC: Platform Modernization" title="" id="52" name="Picture"/>
+            <wp:docPr descr="Legacy PBX to Teams Phone GCC: Platform Modernization" title="" id="58" name="Picture"/>
             <a:graphic>
               <a:graphicData uri="http://schemas.openxmlformats.org/drawingml/2006/picture">
                 <pic:pic>
                   <pic:nvPicPr>
-                    <pic:cNvPr descr="figs/tc-fig-12-pbx-migration.png" id="53" name="Picture"/>
+                    <pic:cNvPr descr="figs/tc-fig-12-pbx-migration.png" id="59" name="Picture"/>
                     <pic:cNvPicPr>
                       <a:picLocks noChangeArrowheads="1" noChangeAspect="1"/>
                     </pic:cNvPicPr>
                   </pic:nvPicPr>
                   <pic:blipFill>
-                    <a:blip r:embed="rId51"/>
+                    <a:blip r:embed="rId57"/>
                     <a:stretch>
                       <a:fillRect/>
                     </a:stretch>
@@ -2497,8 +2628,8 @@
         <w:t xml:space="preserve">Legacy PBX to Teams Phone GCC: Platform Modernization</w:t>
       </w:r>
     </w:p>
-    <w:bookmarkEnd w:id="54"/>
-    <w:bookmarkStart w:id="55" w:name="Xc6d6f0f9ab976088fca5f667c98e6f2686f49b2"/>
+    <w:bookmarkEnd w:id="60"/>
+    <w:bookmarkStart w:id="61" w:name="Xc6d6f0f9ab976088fca5f667c98e6f2686f49b2"/>
     <w:p>
       <w:pPr>
         <w:pStyle w:val="Heading2"/>
@@ -2579,9 +2710,9 @@
         <w:t xml:space="preserve">Legacy analog fax lines cannot be replaced with Teams Phone without a fax-over-IP (FoIP) solution or a cloud fax service. Fax lines should be inventoried and handled separately from voice number porting.</w:t>
       </w:r>
     </w:p>
-    <w:bookmarkEnd w:id="55"/>
-    <w:bookmarkEnd w:id="56"/>
-    <w:bookmarkStart w:id="71" w:name="one-investment-two-platforms"/>
+    <w:bookmarkEnd w:id="61"/>
+    <w:bookmarkEnd w:id="62"/>
+    <w:bookmarkStart w:id="77" w:name="one-investment-two-platforms"/>
     <w:p>
       <w:pPr>
         <w:pStyle w:val="Heading1"/>
@@ -2590,7 +2721,7 @@
         <w:t xml:space="preserve">5. One Investment: Two Platforms</w:t>
       </w:r>
     </w:p>
-    <w:bookmarkStart w:id="60" w:name="the-architecture-both-platforms-require"/>
+    <w:bookmarkStart w:id="66" w:name="the-architecture-both-platforms-require"/>
     <w:p>
       <w:pPr>
         <w:pStyle w:val="Heading2"/>
@@ -2608,18 +2739,18 @@
           <wp:inline>
             <wp:extent cx="5334000" cy="3022600"/>
             <wp:effectExtent b="0" l="0" r="0" t="0"/>
-            <wp:docPr descr="One SD-WAN Investment: Two Voice Platforms" title="" id="58" name="Picture"/>
+            <wp:docPr descr="One SD-WAN Investment: Two Voice Platforms" title="" id="64" name="Picture"/>
             <a:graphic>
               <a:graphicData uri="http://schemas.openxmlformats.org/drawingml/2006/picture">
                 <pic:pic>
                   <pic:nvPicPr>
-                    <pic:cNvPr descr="figs/tc-fig-03-dual-platform-hub.png" id="59" name="Picture"/>
+                    <pic:cNvPr descr="figs/tc-fig-03-dual-platform-hub.png" id="65" name="Picture"/>
                     <pic:cNvPicPr>
                       <a:picLocks noChangeArrowheads="1" noChangeAspect="1"/>
                     </pic:cNvPicPr>
                   </pic:nvPicPr>
                   <pic:blipFill>
-                    <a:blip r:embed="rId57"/>
+                    <a:blip r:embed="rId63"/>
                     <a:stretch>
                       <a:fillRect/>
                     </a:stretch>
@@ -2674,8 +2805,8 @@
         <w:t xml:space="preserve">It is Application-Aware Networking — a network architecture in which policy decisions, path selection, security enforcement, and traffic treatment are determined by the full context of a transaction: application identity, user identity, device posture, and behavioral characteristics. Not by source IP and port alone.</w:t>
       </w:r>
     </w:p>
-    <w:bookmarkEnd w:id="60"/>
-    <w:bookmarkStart w:id="65" w:name="X119a6ef9ab3643d048ae2abef2403893680628b"/>
+    <w:bookmarkEnd w:id="66"/>
+    <w:bookmarkStart w:id="71" w:name="X119a6ef9ab3643d048ae2abef2403893680628b"/>
     <w:p>
       <w:pPr>
         <w:pStyle w:val="Heading2"/>
@@ -2693,18 +2824,18 @@
           <wp:inline>
             <wp:extent cx="5334000" cy="2755900"/>
             <wp:effectExtent b="0" l="0" r="0" t="0"/>
-            <wp:docPr descr="Hybrid Agent: Dual Concurrent Voice Streams" title="" id="62" name="Picture"/>
+            <wp:docPr descr="Hybrid Agent: Dual Concurrent Voice Streams" title="" id="68" name="Picture"/>
             <a:graphic>
               <a:graphicData uri="http://schemas.openxmlformats.org/drawingml/2006/picture">
                 <pic:pic>
                   <pic:nvPicPr>
-                    <pic:cNvPr descr="figs/tc-fig-04-hybrid-agent.png" id="63" name="Picture"/>
+                    <pic:cNvPr descr="figs/tc-fig-04-hybrid-agent.png" id="69" name="Picture"/>
                     <pic:cNvPicPr>
                       <a:picLocks noChangeArrowheads="1" noChangeAspect="1"/>
                     </pic:cNvPicPr>
                   </pic:nvPicPr>
                   <pic:blipFill>
-                    <a:blip r:embed="rId61"/>
+                    <a:blip r:embed="rId67"/>
                     <a:stretch>
                       <a:fillRect/>
                     </a:stretch>
@@ -2767,7 +2898,7 @@
         <w:t xml:space="preserve">At a field office with 20 concurrent hybrid agents, this is 4 Mbps of DSCP EF traffic that must be accommodated on the lowest-latency path at peak.</w:t>
       </w:r>
     </w:p>
-    <w:bookmarkStart w:id="64" w:name="headset-and-browser-configuration"/>
+    <w:bookmarkStart w:id="70" w:name="headset-and-browser-configuration"/>
     <w:p>
       <w:pPr>
         <w:pStyle w:val="Heading3"/>
@@ -2812,9 +2943,9 @@
         <w:t xml:space="preserve">Headset configuration must be standardized across the agent population before go-live on both platforms. Ad hoc headset choices create support complexity and inconsistent audio quality that confounds troubleshooting.</w:t>
       </w:r>
     </w:p>
-    <w:bookmarkEnd w:id="64"/>
-    <w:bookmarkEnd w:id="65"/>
-    <w:bookmarkStart w:id="66" w:name="Xd43b70dd148dff0e4376593b87afb1af30bd473"/>
+    <w:bookmarkEnd w:id="70"/>
+    <w:bookmarkEnd w:id="71"/>
+    <w:bookmarkStart w:id="72" w:name="Xd43b70dd148dff0e4376593b87afb1af30bd473"/>
     <w:p>
       <w:pPr>
         <w:pStyle w:val="Heading2"/>
@@ -2897,8 +3028,8 @@
         <w:t xml:space="preserve">the browser interface for Amazon Connect and the Teams application interface. Highest-throughput path. These tolerate 200–500 ms of latency without affecting call quality and should not compete with voice for the latency-sensitive path.</w:t>
       </w:r>
     </w:p>
-    <w:bookmarkEnd w:id="66"/>
-    <w:bookmarkStart w:id="70" w:name="sd-wan-and-sase-stack-architecture"/>
+    <w:bookmarkEnd w:id="72"/>
+    <w:bookmarkStart w:id="76" w:name="sd-wan-and-sase-stack-architecture"/>
     <w:p>
       <w:pPr>
         <w:pStyle w:val="Heading2"/>
@@ -3208,18 +3339,18 @@
                 <wp:inline>
                   <wp:extent cx="152400" cy="152400"/>
                   <wp:effectExtent b="0" l="0" r="0" t="0"/>
-                  <wp:docPr descr="" title="" id="68" name="Picture"/>
+                  <wp:docPr descr="" title="" id="74" name="Picture"/>
                   <a:graphic>
                     <a:graphicData uri="http://schemas.openxmlformats.org/drawingml/2006/picture">
                       <pic:pic>
                         <pic:nvPicPr>
-                          <pic:cNvPr descr="/opt/quarto/share/formats/docx/note.png" id="69" name="Picture"/>
+                          <pic:cNvPr descr="C:\Program Files\Quarto\share\formats\docx\note.png" id="75" name="Picture"/>
                           <pic:cNvPicPr>
                             <a:picLocks noChangeArrowheads="1" noChangeAspect="1"/>
                           </pic:cNvPicPr>
                         </pic:nvPicPr>
                         <pic:blipFill>
-                          <a:blip r:embed="rId67"/>
+                          <a:blip r:embed="rId73"/>
                           <a:stretch>
                             <a:fillRect/>
                           </a:stretch>
@@ -3283,9 +3414,9 @@
         </w:tc>
       </w:tr>
     </w:tbl>
-    <w:bookmarkEnd w:id="70"/>
-    <w:bookmarkEnd w:id="71"/>
-    <w:bookmarkStart w:id="75" w:name="X50c43ddecf199ebf91917431a313350dc266772"/>
+    <w:bookmarkEnd w:id="76"/>
+    <w:bookmarkEnd w:id="77"/>
+    <w:bookmarkStart w:id="81" w:name="X50c43ddecf199ebf91917431a313350dc266772"/>
     <w:p>
       <w:pPr>
         <w:pStyle w:val="Heading1"/>
@@ -3303,18 +3434,18 @@
           <wp:inline>
             <wp:extent cx="5334000" cy="2933700"/>
             <wp:effectExtent b="0" l="0" r="0" t="0"/>
-            <wp:docPr descr="DIA Enables — SASE Achieves: NIST Control Stack" title="" id="73" name="Picture"/>
+            <wp:docPr descr="DIA Enables — SASE Achieves: NIST Control Stack" title="" id="79" name="Picture"/>
             <a:graphic>
               <a:graphicData uri="http://schemas.openxmlformats.org/drawingml/2006/picture">
                 <pic:pic>
                   <pic:nvPicPr>
-                    <pic:cNvPr descr="figs/tc-fig-05-sase-stack.png" id="74" name="Picture"/>
+                    <pic:cNvPr descr="figs/tc-fig-05-sase-stack.png" id="80" name="Picture"/>
                     <pic:cNvPicPr>
                       <a:picLocks noChangeArrowheads="1" noChangeAspect="1"/>
                     </pic:cNvPicPr>
                   </pic:nvPicPr>
                   <pic:blipFill>
-                    <a:blip r:embed="rId72"/>
+                    <a:blip r:embed="rId78"/>
                     <a:stretch>
                       <a:fillRect/>
                     </a:stretch>
@@ -3717,8 +3848,8 @@
         <w:t xml:space="preserve">For Amazon Connect and Teams Phone, DIA solves the G.114 latency problem by eliminating the geographic hairpin. That is its entire contribution to the compliance picture. A field office deployment that adds DIA without the SASE control stack has better latency and the same compliance gaps. The NIST controls are not satisfied by the pipe. They are satisfied by what governs the pipe.</w:t>
       </w:r>
     </w:p>
-    <w:bookmarkEnd w:id="75"/>
-    <w:bookmarkStart w:id="77" w:name="Xc2560083c76569be9743a47f334c5a0f3d3f7e2"/>
+    <w:bookmarkEnd w:id="81"/>
+    <w:bookmarkStart w:id="86" w:name="Xc2560083c76569be9743a47f334c5a0f3d3f7e2"/>
     <w:p>
       <w:pPr>
         <w:pStyle w:val="Heading1"/>
@@ -3769,6 +3900,61 @@
     </w:p>
     <w:p>
       <w:pPr>
+        <w:pStyle w:val="CaptionedFigure"/>
+      </w:pPr>
+      <w:r>
+        <w:drawing>
+          <wp:inline>
+            <wp:extent cx="5334000" cy="3000375"/>
+            <wp:effectExtent b="0" l="0" r="0" t="0"/>
+            <wp:docPr descr="TIC 3.0: the two use cases governing agency voice and the permissibility rule" title="" id="83" name="Picture"/>
+            <a:graphic>
+              <a:graphicData uri="http://schemas.openxmlformats.org/drawingml/2006/picture">
+                <pic:pic>
+                  <pic:nvPicPr>
+                    <pic:cNvPr descr="figs/tc-fig-17-tic3-pep.png" id="84" name="Picture"/>
+                    <pic:cNvPicPr>
+                      <a:picLocks noChangeArrowheads="1" noChangeAspect="1"/>
+                    </pic:cNvPicPr>
+                  </pic:nvPicPr>
+                  <pic:blipFill>
+                    <a:blip r:embed="rId82"/>
+                    <a:stretch>
+                      <a:fillRect/>
+                    </a:stretch>
+                  </pic:blipFill>
+                  <pic:spPr bwMode="auto">
+                    <a:xfrm>
+                      <a:off x="0" y="0"/>
+                      <a:ext cx="5334000" cy="3000375"/>
+                    </a:xfrm>
+                    <a:prstGeom prst="rect">
+                      <a:avLst/>
+                    </a:prstGeom>
+                    <a:noFill/>
+                    <a:ln w="9525">
+                      <a:noFill/>
+                      <a:headEnd/>
+                      <a:tailEnd/>
+                    </a:ln>
+                  </pic:spPr>
+                </pic:pic>
+              </a:graphicData>
+            </a:graphic>
+          </wp:inline>
+        </w:drawing>
+      </w:r>
+    </w:p>
+    <w:p>
+      <w:pPr>
+        <w:pStyle w:val="ImageCaption"/>
+      </w:pPr>
+      <w:r>
+        <w:t xml:space="preserve">TIC 3.0: the two use cases governing agency voice and the permissibility rule</w:t>
+      </w:r>
+    </w:p>
+    <w:p>
+      <w:pPr>
         <w:pStyle w:val="BodyText"/>
       </w:pPr>
       <w:r>
@@ -3804,7 +3990,7 @@
         <w:t xml:space="preserve">governing each traffic path.</w:t>
       </w:r>
     </w:p>
-    <w:bookmarkStart w:id="76" w:name="Xf792461b15ccbbb54b15b5402bbf9475c6529ad"/>
+    <w:bookmarkStart w:id="85" w:name="Xf792461b15ccbbb54b15b5402bbf9475c6529ad"/>
     <w:p>
       <w:pPr>
         <w:pStyle w:val="Heading2"/>
@@ -4099,9 +4285,9 @@
         <w:t xml:space="preserve">The operational conclusion joins the two halves. The physics half — G.114’s budget — remains the driver: it is why the network must be modernized before either voice platform goes live, and it is measured in milliseconds at every agent location. The policy half — TIC 3.0’s catalog-at-the-PEP condition — is what makes the resulting architecture authorizable. The same SD-WAN + SASE investment satisfies both at once, which is why this document treats them as one program: local breakout to meet the delay budget, and the distributed PEP to make that breakout lawful.</w:t>
       </w:r>
     </w:p>
-    <w:bookmarkEnd w:id="76"/>
-    <w:bookmarkEnd w:id="77"/>
-    <w:bookmarkStart w:id="91" w:name="Xdff915852ecfb7099a0dce077831b9d7635e7fa"/>
+    <w:bookmarkEnd w:id="85"/>
+    <w:bookmarkEnd w:id="86"/>
+    <w:bookmarkStart w:id="100" w:name="Xdff915852ecfb7099a0dce077831b9d7635e7fa"/>
     <w:p>
       <w:pPr>
         <w:pStyle w:val="Heading1"/>
@@ -4119,18 +4305,18 @@
           <wp:inline>
             <wp:extent cx="5334000" cy="2726266"/>
             <wp:effectExtent b="0" l="0" r="0" t="0"/>
-            <wp:docPr descr="FedRAMP 20x Consolidated Rules: Telecommunications Implications" title="" id="79" name="Picture"/>
+            <wp:docPr descr="FedRAMP 20x Consolidated Rules: Telecommunications Implications" title="" id="88" name="Picture"/>
             <a:graphic>
               <a:graphicData uri="http://schemas.openxmlformats.org/drawingml/2006/picture">
                 <pic:pic>
                   <pic:nvPicPr>
-                    <pic:cNvPr descr="figs/tc-fig-13-fedramp-20x-telecom.png" id="80" name="Picture"/>
+                    <pic:cNvPr descr="figs/tc-fig-13-fedramp-20x-telecom.png" id="89" name="Picture"/>
                     <pic:cNvPicPr>
                       <a:picLocks noChangeArrowheads="1" noChangeAspect="1"/>
                     </pic:cNvPicPr>
                   </pic:nvPicPr>
                   <pic:blipFill>
-                    <a:blip r:embed="rId78"/>
+                    <a:blip r:embed="rId87"/>
                     <a:stretch>
                       <a:fillRect/>
                     </a:stretch>
@@ -4165,7 +4351,7 @@
         <w:t xml:space="preserve">FedRAMP 20x Consolidated Rules: Telecommunications Implications</w:t>
       </w:r>
     </w:p>
-    <w:bookmarkStart w:id="84" w:name="sec-fedramp-20x-telecom"/>
+    <w:bookmarkStart w:id="93" w:name="sec-fedramp-20x-telecom"/>
     <w:p>
       <w:pPr>
         <w:pStyle w:val="Heading2"/>
@@ -4614,18 +4800,18 @@
                 <wp:inline>
                   <wp:extent cx="152400" cy="152400"/>
                   <wp:effectExtent b="0" l="0" r="0" t="0"/>
-                  <wp:docPr descr="" title="" id="82" name="Picture"/>
+                  <wp:docPr descr="" title="" id="91" name="Picture"/>
                   <a:graphic>
                     <a:graphicData uri="http://schemas.openxmlformats.org/drawingml/2006/picture">
                       <pic:pic>
                         <pic:nvPicPr>
-                          <pic:cNvPr descr="/opt/quarto/share/formats/docx/tip.png" id="83" name="Picture"/>
+                          <pic:cNvPr descr="C:\Program Files\Quarto\share\formats\docx\tip.png" id="92" name="Picture"/>
                           <pic:cNvPicPr>
                             <a:picLocks noChangeArrowheads="1" noChangeAspect="1"/>
                           </pic:cNvPicPr>
                         </pic:nvPicPr>
                         <pic:blipFill>
-                          <a:blip r:embed="rId81"/>
+                          <a:blip r:embed="rId90"/>
                           <a:stretch>
                             <a:fillRect/>
                           </a:stretch>
@@ -4715,8 +4901,8 @@
         </w:tc>
       </w:tr>
     </w:tbl>
-    <w:bookmarkEnd w:id="84"/>
-    <w:bookmarkStart w:id="85" w:name="X7409e10531376a3c99a5e9f5e98c45fb0a0a3d0"/>
+    <w:bookmarkEnd w:id="93"/>
+    <w:bookmarkStart w:id="94" w:name="X7409e10531376a3c99a5e9f5e98c45fb0a0a3d0"/>
     <w:p>
       <w:pPr>
         <w:pStyle w:val="Heading2"/>
@@ -4843,8 +5029,8 @@
         <w:t xml:space="preserve">The specific authorization permitting .com Connect must be reviewed at each ATO renewal. The exception is not a permanent waiver; it is a time-bounded, condition-bounded authorization that requires active maintenance.</w:t>
       </w:r>
     </w:p>
-    <w:bookmarkEnd w:id="85"/>
-    <w:bookmarkStart w:id="86" w:name="teams-phone-gcc-boundary-and-pstn"/>
+    <w:bookmarkEnd w:id="94"/>
+    <w:bookmarkStart w:id="95" w:name="teams-phone-gcc-boundary-and-pstn"/>
     <w:p>
       <w:pPr>
         <w:pStyle w:val="Heading2"/>
@@ -4861,8 +5047,8 @@
         <w:t xml:space="preserve">Teams Phone in GCC Moderate operates within the GCC boundary for all call signaling, voicemail storage, call history, and user policy management. The PSTN interconnect (via Direct Routing SBC or Calling Plans) is a boundary crossing by definition: the PSTN is a public network. The SBC in Direct Routing handles the crossing point. Its configuration must be documented in the SSP as a boundary interface.</w:t>
       </w:r>
     </w:p>
-    <w:bookmarkEnd w:id="86"/>
-    <w:bookmarkStart w:id="90" w:name="X6519cabc81b3848456687843ce47cf45a8be6c7"/>
+    <w:bookmarkEnd w:id="95"/>
+    <w:bookmarkStart w:id="99" w:name="X6519cabc81b3848456687843ce47cf45a8be6c7"/>
     <w:p>
       <w:pPr>
         <w:pStyle w:val="Heading2"/>
@@ -5393,18 +5579,18 @@
           <wp:inline>
             <wp:extent cx="5334000" cy="2844800"/>
             <wp:effectExtent b="0" l="0" r="0" t="0"/>
-            <wp:docPr descr="Implementation Roadmap: Network First, Platforms Second" title="" id="88" name="Picture"/>
+            <wp:docPr descr="Implementation Roadmap: Network First, Platforms Second" title="" id="97" name="Picture"/>
             <a:graphic>
               <a:graphicData uri="http://schemas.openxmlformats.org/drawingml/2006/picture">
                 <pic:pic>
                   <pic:nvPicPr>
-                    <pic:cNvPr descr="figs/tc-fig-14-implementation-gantt.png" id="89" name="Picture"/>
+                    <pic:cNvPr descr="figs/tc-fig-14-implementation-gantt.png" id="98" name="Picture"/>
                     <pic:cNvPicPr>
                       <a:picLocks noChangeArrowheads="1" noChangeAspect="1"/>
                     </pic:cNvPicPr>
                   </pic:nvPicPr>
                   <pic:blipFill>
-                    <a:blip r:embed="rId87"/>
+                    <a:blip r:embed="rId96"/>
                     <a:stretch>
                       <a:fillRect/>
                     </a:stretch>
@@ -5439,9 +5625,9 @@
         <w:t xml:space="preserve">Implementation Roadmap: Network First, Platforms Second</w:t>
       </w:r>
     </w:p>
-    <w:bookmarkEnd w:id="90"/>
-    <w:bookmarkEnd w:id="91"/>
-    <w:bookmarkStart w:id="96" w:name="implementation-roadmap"/>
+    <w:bookmarkEnd w:id="99"/>
+    <w:bookmarkEnd w:id="100"/>
+    <w:bookmarkStart w:id="105" w:name="implementation-roadmap"/>
     <w:p>
       <w:pPr>
         <w:pStyle w:val="Heading1"/>
@@ -5468,7 +5654,7 @@
         <w:t xml:space="preserve">Voice quality failures discovered after contact center or PBX migration are dramatically more expensive to remediate than network infrastructure investments made before migration. No field office should go live on Amazon Connect or Teams Phone until the network foundation for that office is validated against G.114 requirements. Validation means measuring actual one-way latency, jitter, and packet loss from each agent workstation to AWS us-west-2 and to the Microsoft GCC edge, with local breakout active, and confirming all three parameters are within specification.</w:t>
       </w:r>
     </w:p>
-    <w:bookmarkStart w:id="92" w:name="phase-1-network-foundation-months-13"/>
+    <w:bookmarkStart w:id="101" w:name="phase-1-network-foundation-months-13"/>
     <w:p>
       <w:pPr>
         <w:pStyle w:val="Heading2"/>
@@ -5565,8 +5751,8 @@
         <w:t xml:space="preserve">Size DSCP EF capacity for peak hybrid agent load: (max concurrent hybrid agents) × 200 Kbps</w:t>
       </w:r>
     </w:p>
-    <w:bookmarkEnd w:id="92"/>
-    <w:bookmarkStart w:id="93" w:name="Xfdd51caf3fe6a11d0a4df23f20af5ae637d7021"/>
+    <w:bookmarkEnd w:id="101"/>
+    <w:bookmarkStart w:id="102" w:name="Xfdd51caf3fe6a11d0a4df23f20af5ae637d7021"/>
     <w:p>
       <w:pPr>
         <w:pStyle w:val="Heading2"/>
@@ -5647,8 +5833,8 @@
         <w:t xml:space="preserve">Validate CRM/case management integration; document data flow in SSP</w:t>
       </w:r>
     </w:p>
-    <w:bookmarkEnd w:id="93"/>
-    <w:bookmarkStart w:id="94" w:name="phase-3-teams-phone-deployment-months-48"/>
+    <w:bookmarkEnd w:id="102"/>
+    <w:bookmarkStart w:id="103" w:name="phase-3-teams-phone-deployment-months-48"/>
     <w:p>
       <w:pPr>
         <w:pStyle w:val="Heading2"/>
@@ -5729,8 +5915,8 @@
         <w:t xml:space="preserve">Port numbers in geographic tranches; maintain parallel PBX operation through each tranche</w:t>
       </w:r>
     </w:p>
-    <w:bookmarkEnd w:id="94"/>
-    <w:bookmarkStart w:id="95" w:name="X9d7b7ecc3f0b58540fc3182ad13f1c94567e114"/>
+    <w:bookmarkEnd w:id="103"/>
+    <w:bookmarkStart w:id="104" w:name="X9d7b7ecc3f0b58540fc3182ad13f1c94567e114"/>
     <w:p>
       <w:pPr>
         <w:pStyle w:val="Heading2"/>
@@ -5809,9 +5995,9 @@
         <w:t xml:space="preserve">Configure SD-WAN telemetry exports in machine-readable JSON format; ensure Connect audit logs, authentication events, and boundary crossing records meet structured KSI format requirements; validate SBC event logs feed SIEM in queryable format</w:t>
       </w:r>
     </w:p>
-    <w:bookmarkEnd w:id="95"/>
-    <w:bookmarkEnd w:id="96"/>
-    <w:bookmarkStart w:id="97" w:name="federal-framework-alignment"/>
+    <w:bookmarkEnd w:id="104"/>
+    <w:bookmarkEnd w:id="105"/>
+    <w:bookmarkStart w:id="106" w:name="federal-framework-alignment"/>
     <w:p>
       <w:pPr>
         <w:pStyle w:val="Heading1"/>
@@ -6396,7 +6582,7 @@
         </w:tc>
       </w:tr>
     </w:tbl>
-    <w:bookmarkEnd w:id="97"/>
+    <w:bookmarkEnd w:id="106"/>
     <w:sectPr>
       <w:footnotePr>
         <w:numRestart w:val="eachSect"/>

</xml_diff>